<commit_message>
log Abramova week 6
</commit_message>
<xml_diff>
--- a/Reports, Logs & Evaluations/Time Logs/Team Log Abramova (2).docx
+++ b/Reports, Logs & Evaluations/Time Logs/Team Log Abramova (2).docx
@@ -3472,6 +3472,773 @@
                 <w:rtl w:val="0"/>
               </w:rPr>
               <w:t xml:space="preserve">Week Total: 6 h 20 m</w:t>
+            </w:r>
+          </w:p>
+        </w:tc>
+      </w:tr>
+      <w:tr>
+        <w:trPr>
+          <w:cantSplit w:val="0"/>
+          <w:tblHeader w:val="0"/>
+        </w:trPr>
+        <w:tc>
+          <w:tcPr>
+            <w:shd w:fill="auto" w:val="clear"/>
+            <w:tcMar>
+              <w:top w:w="100.0" w:type="dxa"/>
+              <w:left w:w="100.0" w:type="dxa"/>
+              <w:bottom w:w="100.0" w:type="dxa"/>
+              <w:right w:w="100.0" w:type="dxa"/>
+            </w:tcMar>
+            <w:vAlign w:val="top"/>
+          </w:tcPr>
+          <w:p>
+            <w:pPr>
+              <w:widowControl w:val="0"/>
+              <w:spacing w:line="240" w:lineRule="auto"/>
+              <w:rPr/>
+            </w:pPr>
+            <w:r>
+              <w:rPr>
+                <w:rtl w:val="0"/>
+              </w:rPr>
+              <w:t xml:space="preserve">19/10/26-25/10/26</w:t>
+            </w:r>
+          </w:p>
+        </w:tc>
+        <w:tc>
+          <w:tcPr>
+            <w:shd w:fill="auto" w:val="clear"/>
+            <w:tcMar>
+              <w:top w:w="100.0" w:type="dxa"/>
+              <w:left w:w="100.0" w:type="dxa"/>
+              <w:bottom w:w="100.0" w:type="dxa"/>
+              <w:right w:w="100.0" w:type="dxa"/>
+            </w:tcMar>
+            <w:vAlign w:val="top"/>
+          </w:tcPr>
+          <w:p>
+            <w:pPr>
+              <w:widowControl w:val="0"/>
+              <w:spacing w:line="240" w:lineRule="auto"/>
+              <w:rPr/>
+            </w:pPr>
+            <w:r>
+              <w:rPr>
+                <w:rtl w:val="0"/>
+              </w:rPr>
+              <w:t xml:space="preserve">Use Case Diagram and text</w:t>
+            </w:r>
+          </w:p>
+        </w:tc>
+        <w:tc>
+          <w:tcPr>
+            <w:shd w:fill="auto" w:val="clear"/>
+            <w:tcMar>
+              <w:top w:w="100.0" w:type="dxa"/>
+              <w:left w:w="100.0" w:type="dxa"/>
+              <w:bottom w:w="100.0" w:type="dxa"/>
+              <w:right w:w="100.0" w:type="dxa"/>
+            </w:tcMar>
+            <w:vAlign w:val="top"/>
+          </w:tcPr>
+          <w:p>
+            <w:pPr>
+              <w:widowControl w:val="0"/>
+              <w:spacing w:line="240" w:lineRule="auto"/>
+              <w:rPr/>
+            </w:pPr>
+            <w:r>
+              <w:rPr>
+                <w:rtl w:val="0"/>
+              </w:rPr>
+              <w:t xml:space="preserve">19.10.2026</w:t>
+            </w:r>
+          </w:p>
+        </w:tc>
+        <w:tc>
+          <w:tcPr>
+            <w:shd w:fill="auto" w:val="clear"/>
+            <w:tcMar>
+              <w:top w:w="100.0" w:type="dxa"/>
+              <w:left w:w="100.0" w:type="dxa"/>
+              <w:bottom w:w="100.0" w:type="dxa"/>
+              <w:right w:w="100.0" w:type="dxa"/>
+            </w:tcMar>
+            <w:vAlign w:val="top"/>
+          </w:tcPr>
+          <w:p>
+            <w:pPr>
+              <w:widowControl w:val="0"/>
+              <w:spacing w:line="240" w:lineRule="auto"/>
+              <w:rPr/>
+            </w:pPr>
+            <w:r>
+              <w:rPr>
+                <w:rtl w:val="0"/>
+              </w:rPr>
+              <w:t xml:space="preserve">9 pm</w:t>
+            </w:r>
+          </w:p>
+        </w:tc>
+        <w:tc>
+          <w:tcPr>
+            <w:shd w:fill="auto" w:val="clear"/>
+            <w:tcMar>
+              <w:top w:w="100.0" w:type="dxa"/>
+              <w:left w:w="100.0" w:type="dxa"/>
+              <w:bottom w:w="100.0" w:type="dxa"/>
+              <w:right w:w="100.0" w:type="dxa"/>
+            </w:tcMar>
+            <w:vAlign w:val="top"/>
+          </w:tcPr>
+          <w:p>
+            <w:pPr>
+              <w:widowControl w:val="0"/>
+              <w:spacing w:line="240" w:lineRule="auto"/>
+              <w:rPr/>
+            </w:pPr>
+            <w:r>
+              <w:rPr>
+                <w:rtl w:val="0"/>
+              </w:rPr>
+              <w:t xml:space="preserve">12 am</w:t>
+            </w:r>
+          </w:p>
+        </w:tc>
+        <w:tc>
+          <w:tcPr>
+            <w:shd w:fill="auto" w:val="clear"/>
+            <w:tcMar>
+              <w:top w:w="100.0" w:type="dxa"/>
+              <w:left w:w="100.0" w:type="dxa"/>
+              <w:bottom w:w="100.0" w:type="dxa"/>
+              <w:right w:w="100.0" w:type="dxa"/>
+            </w:tcMar>
+            <w:vAlign w:val="top"/>
+          </w:tcPr>
+          <w:p>
+            <w:pPr>
+              <w:widowControl w:val="0"/>
+              <w:spacing w:line="240" w:lineRule="auto"/>
+              <w:rPr/>
+            </w:pPr>
+            <w:r>
+              <w:rPr>
+                <w:rtl w:val="0"/>
+              </w:rPr>
+              <w:t xml:space="preserve">3 h</w:t>
+            </w:r>
+          </w:p>
+        </w:tc>
+      </w:tr>
+      <w:tr>
+        <w:trPr>
+          <w:cantSplit w:val="0"/>
+          <w:tblHeader w:val="0"/>
+        </w:trPr>
+        <w:tc>
+          <w:tcPr>
+            <w:shd w:fill="auto" w:val="clear"/>
+            <w:tcMar>
+              <w:top w:w="100.0" w:type="dxa"/>
+              <w:left w:w="100.0" w:type="dxa"/>
+              <w:bottom w:w="100.0" w:type="dxa"/>
+              <w:right w:w="100.0" w:type="dxa"/>
+            </w:tcMar>
+            <w:vAlign w:val="top"/>
+          </w:tcPr>
+          <w:p>
+            <w:pPr>
+              <w:widowControl w:val="0"/>
+              <w:spacing w:line="240" w:lineRule="auto"/>
+              <w:rPr/>
+            </w:pPr>
+            <w:r>
+              <w:rPr>
+                <w:rtl w:val="0"/>
+              </w:rPr>
+            </w:r>
+          </w:p>
+        </w:tc>
+        <w:tc>
+          <w:tcPr>
+            <w:shd w:fill="auto" w:val="clear"/>
+            <w:tcMar>
+              <w:top w:w="100.0" w:type="dxa"/>
+              <w:left w:w="100.0" w:type="dxa"/>
+              <w:bottom w:w="100.0" w:type="dxa"/>
+              <w:right w:w="100.0" w:type="dxa"/>
+            </w:tcMar>
+            <w:vAlign w:val="top"/>
+          </w:tcPr>
+          <w:p>
+            <w:pPr>
+              <w:widowControl w:val="0"/>
+              <w:spacing w:line="240" w:lineRule="auto"/>
+              <w:rPr/>
+            </w:pPr>
+            <w:r>
+              <w:rPr>
+                <w:rtl w:val="0"/>
+              </w:rPr>
+              <w:t xml:space="preserve">Finishing report</w:t>
+            </w:r>
+          </w:p>
+        </w:tc>
+        <w:tc>
+          <w:tcPr>
+            <w:shd w:fill="auto" w:val="clear"/>
+            <w:tcMar>
+              <w:top w:w="100.0" w:type="dxa"/>
+              <w:left w:w="100.0" w:type="dxa"/>
+              <w:bottom w:w="100.0" w:type="dxa"/>
+              <w:right w:w="100.0" w:type="dxa"/>
+            </w:tcMar>
+            <w:vAlign w:val="top"/>
+          </w:tcPr>
+          <w:p>
+            <w:pPr>
+              <w:widowControl w:val="0"/>
+              <w:spacing w:line="240" w:lineRule="auto"/>
+              <w:rPr/>
+            </w:pPr>
+            <w:r>
+              <w:rPr>
+                <w:rtl w:val="0"/>
+              </w:rPr>
+              <w:t xml:space="preserve">20.10.2026</w:t>
+            </w:r>
+          </w:p>
+        </w:tc>
+        <w:tc>
+          <w:tcPr>
+            <w:shd w:fill="auto" w:val="clear"/>
+            <w:tcMar>
+              <w:top w:w="100.0" w:type="dxa"/>
+              <w:left w:w="100.0" w:type="dxa"/>
+              <w:bottom w:w="100.0" w:type="dxa"/>
+              <w:right w:w="100.0" w:type="dxa"/>
+            </w:tcMar>
+            <w:vAlign w:val="top"/>
+          </w:tcPr>
+          <w:p>
+            <w:pPr>
+              <w:widowControl w:val="0"/>
+              <w:spacing w:line="240" w:lineRule="auto"/>
+              <w:rPr/>
+            </w:pPr>
+            <w:r>
+              <w:rPr>
+                <w:rtl w:val="0"/>
+              </w:rPr>
+              <w:t xml:space="preserve">6 pm </w:t>
+            </w:r>
+          </w:p>
+        </w:tc>
+        <w:tc>
+          <w:tcPr>
+            <w:shd w:fill="auto" w:val="clear"/>
+            <w:tcMar>
+              <w:top w:w="100.0" w:type="dxa"/>
+              <w:left w:w="100.0" w:type="dxa"/>
+              <w:bottom w:w="100.0" w:type="dxa"/>
+              <w:right w:w="100.0" w:type="dxa"/>
+            </w:tcMar>
+            <w:vAlign w:val="top"/>
+          </w:tcPr>
+          <w:p>
+            <w:pPr>
+              <w:widowControl w:val="0"/>
+              <w:spacing w:line="240" w:lineRule="auto"/>
+              <w:rPr/>
+            </w:pPr>
+            <w:r>
+              <w:rPr>
+                <w:rtl w:val="0"/>
+              </w:rPr>
+              <w:t xml:space="preserve">6:50 pm</w:t>
+            </w:r>
+          </w:p>
+        </w:tc>
+        <w:tc>
+          <w:tcPr>
+            <w:shd w:fill="auto" w:val="clear"/>
+            <w:tcMar>
+              <w:top w:w="100.0" w:type="dxa"/>
+              <w:left w:w="100.0" w:type="dxa"/>
+              <w:bottom w:w="100.0" w:type="dxa"/>
+              <w:right w:w="100.0" w:type="dxa"/>
+            </w:tcMar>
+            <w:vAlign w:val="top"/>
+          </w:tcPr>
+          <w:p>
+            <w:pPr>
+              <w:widowControl w:val="0"/>
+              <w:spacing w:line="240" w:lineRule="auto"/>
+              <w:rPr/>
+            </w:pPr>
+            <w:r>
+              <w:rPr>
+                <w:rtl w:val="0"/>
+              </w:rPr>
+              <w:t xml:space="preserve">50 m</w:t>
+            </w:r>
+          </w:p>
+        </w:tc>
+      </w:tr>
+      <w:tr>
+        <w:trPr>
+          <w:cantSplit w:val="0"/>
+          <w:tblHeader w:val="0"/>
+        </w:trPr>
+        <w:tc>
+          <w:tcPr>
+            <w:shd w:fill="auto" w:val="clear"/>
+            <w:tcMar>
+              <w:top w:w="100.0" w:type="dxa"/>
+              <w:left w:w="100.0" w:type="dxa"/>
+              <w:bottom w:w="100.0" w:type="dxa"/>
+              <w:right w:w="100.0" w:type="dxa"/>
+            </w:tcMar>
+            <w:vAlign w:val="top"/>
+          </w:tcPr>
+          <w:p>
+            <w:pPr>
+              <w:widowControl w:val="0"/>
+              <w:spacing w:line="240" w:lineRule="auto"/>
+              <w:rPr/>
+            </w:pPr>
+            <w:r>
+              <w:rPr>
+                <w:rtl w:val="0"/>
+              </w:rPr>
+            </w:r>
+          </w:p>
+        </w:tc>
+        <w:tc>
+          <w:tcPr>
+            <w:shd w:fill="auto" w:val="clear"/>
+            <w:tcMar>
+              <w:top w:w="100.0" w:type="dxa"/>
+              <w:left w:w="100.0" w:type="dxa"/>
+              <w:bottom w:w="100.0" w:type="dxa"/>
+              <w:right w:w="100.0" w:type="dxa"/>
+            </w:tcMar>
+            <w:vAlign w:val="top"/>
+          </w:tcPr>
+          <w:p>
+            <w:pPr>
+              <w:widowControl w:val="0"/>
+              <w:spacing w:line="240" w:lineRule="auto"/>
+              <w:rPr/>
+            </w:pPr>
+            <w:r>
+              <w:rPr>
+                <w:rtl w:val="0"/>
+              </w:rPr>
+              <w:t xml:space="preserve">Meeting with a team to start Phase 3</w:t>
+            </w:r>
+          </w:p>
+        </w:tc>
+        <w:tc>
+          <w:tcPr>
+            <w:shd w:fill="auto" w:val="clear"/>
+            <w:tcMar>
+              <w:top w:w="100.0" w:type="dxa"/>
+              <w:left w:w="100.0" w:type="dxa"/>
+              <w:bottom w:w="100.0" w:type="dxa"/>
+              <w:right w:w="100.0" w:type="dxa"/>
+            </w:tcMar>
+            <w:vAlign w:val="top"/>
+          </w:tcPr>
+          <w:p>
+            <w:pPr>
+              <w:widowControl w:val="0"/>
+              <w:spacing w:line="240" w:lineRule="auto"/>
+              <w:rPr/>
+            </w:pPr>
+            <w:r>
+              <w:rPr>
+                <w:rtl w:val="0"/>
+              </w:rPr>
+              <w:t xml:space="preserve">14.10.2026</w:t>
+            </w:r>
+          </w:p>
+        </w:tc>
+        <w:tc>
+          <w:tcPr>
+            <w:shd w:fill="auto" w:val="clear"/>
+            <w:tcMar>
+              <w:top w:w="100.0" w:type="dxa"/>
+              <w:left w:w="100.0" w:type="dxa"/>
+              <w:bottom w:w="100.0" w:type="dxa"/>
+              <w:right w:w="100.0" w:type="dxa"/>
+            </w:tcMar>
+            <w:vAlign w:val="top"/>
+          </w:tcPr>
+          <w:p>
+            <w:pPr>
+              <w:widowControl w:val="0"/>
+              <w:spacing w:line="240" w:lineRule="auto"/>
+              <w:rPr/>
+            </w:pPr>
+            <w:r>
+              <w:rPr>
+                <w:rtl w:val="0"/>
+              </w:rPr>
+              <w:t xml:space="preserve">4:30 pm</w:t>
+            </w:r>
+          </w:p>
+        </w:tc>
+        <w:tc>
+          <w:tcPr>
+            <w:shd w:fill="auto" w:val="clear"/>
+            <w:tcMar>
+              <w:top w:w="100.0" w:type="dxa"/>
+              <w:left w:w="100.0" w:type="dxa"/>
+              <w:bottom w:w="100.0" w:type="dxa"/>
+              <w:right w:w="100.0" w:type="dxa"/>
+            </w:tcMar>
+            <w:vAlign w:val="top"/>
+          </w:tcPr>
+          <w:p>
+            <w:pPr>
+              <w:widowControl w:val="0"/>
+              <w:spacing w:line="240" w:lineRule="auto"/>
+              <w:rPr/>
+            </w:pPr>
+            <w:r>
+              <w:rPr>
+                <w:rtl w:val="0"/>
+              </w:rPr>
+              <w:t xml:space="preserve">5 pm</w:t>
+            </w:r>
+          </w:p>
+        </w:tc>
+        <w:tc>
+          <w:tcPr>
+            <w:shd w:fill="auto" w:val="clear"/>
+            <w:tcMar>
+              <w:top w:w="100.0" w:type="dxa"/>
+              <w:left w:w="100.0" w:type="dxa"/>
+              <w:bottom w:w="100.0" w:type="dxa"/>
+              <w:right w:w="100.0" w:type="dxa"/>
+            </w:tcMar>
+            <w:vAlign w:val="top"/>
+          </w:tcPr>
+          <w:p>
+            <w:pPr>
+              <w:widowControl w:val="0"/>
+              <w:spacing w:line="240" w:lineRule="auto"/>
+              <w:rPr/>
+            </w:pPr>
+            <w:r>
+              <w:rPr>
+                <w:rtl w:val="0"/>
+              </w:rPr>
+              <w:t xml:space="preserve">30 m</w:t>
+            </w:r>
+          </w:p>
+        </w:tc>
+      </w:tr>
+      <w:tr>
+        <w:trPr>
+          <w:cantSplit w:val="0"/>
+          <w:tblHeader w:val="0"/>
+        </w:trPr>
+        <w:tc>
+          <w:tcPr>
+            <w:shd w:fill="auto" w:val="clear"/>
+            <w:tcMar>
+              <w:top w:w="100.0" w:type="dxa"/>
+              <w:left w:w="100.0" w:type="dxa"/>
+              <w:bottom w:w="100.0" w:type="dxa"/>
+              <w:right w:w="100.0" w:type="dxa"/>
+            </w:tcMar>
+            <w:vAlign w:val="top"/>
+          </w:tcPr>
+          <w:p>
+            <w:pPr>
+              <w:widowControl w:val="0"/>
+              <w:spacing w:line="240" w:lineRule="auto"/>
+              <w:rPr/>
+            </w:pPr>
+            <w:r>
+              <w:rPr>
+                <w:rtl w:val="0"/>
+              </w:rPr>
+            </w:r>
+          </w:p>
+        </w:tc>
+        <w:tc>
+          <w:tcPr>
+            <w:shd w:fill="auto" w:val="clear"/>
+            <w:tcMar>
+              <w:top w:w="100.0" w:type="dxa"/>
+              <w:left w:w="100.0" w:type="dxa"/>
+              <w:bottom w:w="100.0" w:type="dxa"/>
+              <w:right w:w="100.0" w:type="dxa"/>
+            </w:tcMar>
+            <w:vAlign w:val="top"/>
+          </w:tcPr>
+          <w:p>
+            <w:pPr>
+              <w:widowControl w:val="0"/>
+              <w:spacing w:line="240" w:lineRule="auto"/>
+              <w:rPr/>
+            </w:pPr>
+            <w:r>
+              <w:rPr>
+                <w:rtl w:val="0"/>
+              </w:rPr>
+            </w:r>
+          </w:p>
+        </w:tc>
+        <w:tc>
+          <w:tcPr>
+            <w:shd w:fill="auto" w:val="clear"/>
+            <w:tcMar>
+              <w:top w:w="100.0" w:type="dxa"/>
+              <w:left w:w="100.0" w:type="dxa"/>
+              <w:bottom w:w="100.0" w:type="dxa"/>
+              <w:right w:w="100.0" w:type="dxa"/>
+            </w:tcMar>
+            <w:vAlign w:val="top"/>
+          </w:tcPr>
+          <w:p>
+            <w:pPr>
+              <w:widowControl w:val="0"/>
+              <w:spacing w:line="240" w:lineRule="auto"/>
+              <w:rPr/>
+            </w:pPr>
+            <w:r>
+              <w:rPr>
+                <w:rtl w:val="0"/>
+              </w:rPr>
+            </w:r>
+          </w:p>
+        </w:tc>
+        <w:tc>
+          <w:tcPr>
+            <w:shd w:fill="auto" w:val="clear"/>
+            <w:tcMar>
+              <w:top w:w="100.0" w:type="dxa"/>
+              <w:left w:w="100.0" w:type="dxa"/>
+              <w:bottom w:w="100.0" w:type="dxa"/>
+              <w:right w:w="100.0" w:type="dxa"/>
+            </w:tcMar>
+            <w:vAlign w:val="top"/>
+          </w:tcPr>
+          <w:p>
+            <w:pPr>
+              <w:widowControl w:val="0"/>
+              <w:spacing w:line="240" w:lineRule="auto"/>
+              <w:rPr/>
+            </w:pPr>
+            <w:r>
+              <w:rPr>
+                <w:rtl w:val="0"/>
+              </w:rPr>
+            </w:r>
+          </w:p>
+        </w:tc>
+        <w:tc>
+          <w:tcPr>
+            <w:shd w:fill="auto" w:val="clear"/>
+            <w:tcMar>
+              <w:top w:w="100.0" w:type="dxa"/>
+              <w:left w:w="100.0" w:type="dxa"/>
+              <w:bottom w:w="100.0" w:type="dxa"/>
+              <w:right w:w="100.0" w:type="dxa"/>
+            </w:tcMar>
+            <w:vAlign w:val="top"/>
+          </w:tcPr>
+          <w:p>
+            <w:pPr>
+              <w:widowControl w:val="0"/>
+              <w:spacing w:line="240" w:lineRule="auto"/>
+              <w:rPr/>
+            </w:pPr>
+            <w:r>
+              <w:rPr>
+                <w:rtl w:val="0"/>
+              </w:rPr>
+            </w:r>
+          </w:p>
+        </w:tc>
+        <w:tc>
+          <w:tcPr>
+            <w:shd w:fill="auto" w:val="clear"/>
+            <w:tcMar>
+              <w:top w:w="100.0" w:type="dxa"/>
+              <w:left w:w="100.0" w:type="dxa"/>
+              <w:bottom w:w="100.0" w:type="dxa"/>
+              <w:right w:w="100.0" w:type="dxa"/>
+            </w:tcMar>
+            <w:vAlign w:val="top"/>
+          </w:tcPr>
+          <w:p>
+            <w:pPr>
+              <w:widowControl w:val="0"/>
+              <w:spacing w:line="240" w:lineRule="auto"/>
+              <w:rPr/>
+            </w:pPr>
+            <w:r>
+              <w:rPr>
+                <w:rtl w:val="0"/>
+              </w:rPr>
+              <w:t xml:space="preserve">Week Total: 4 h 20 m</w:t>
+            </w:r>
+          </w:p>
+        </w:tc>
+      </w:tr>
+      <w:tr>
+        <w:trPr>
+          <w:cantSplit w:val="0"/>
+          <w:tblHeader w:val="0"/>
+        </w:trPr>
+        <w:tc>
+          <w:tcPr>
+            <w:shd w:fill="auto" w:val="clear"/>
+            <w:tcMar>
+              <w:top w:w="100.0" w:type="dxa"/>
+              <w:left w:w="100.0" w:type="dxa"/>
+              <w:bottom w:w="100.0" w:type="dxa"/>
+              <w:right w:w="100.0" w:type="dxa"/>
+            </w:tcMar>
+            <w:vAlign w:val="top"/>
+          </w:tcPr>
+          <w:p>
+            <w:pPr>
+              <w:widowControl w:val="0"/>
+              <w:spacing w:line="240" w:lineRule="auto"/>
+              <w:rPr/>
+            </w:pPr>
+            <w:r>
+              <w:rPr>
+                <w:rtl w:val="0"/>
+              </w:rPr>
+            </w:r>
+          </w:p>
+        </w:tc>
+        <w:tc>
+          <w:tcPr>
+            <w:shd w:fill="auto" w:val="clear"/>
+            <w:tcMar>
+              <w:top w:w="100.0" w:type="dxa"/>
+              <w:left w:w="100.0" w:type="dxa"/>
+              <w:bottom w:w="100.0" w:type="dxa"/>
+              <w:right w:w="100.0" w:type="dxa"/>
+            </w:tcMar>
+            <w:vAlign w:val="top"/>
+          </w:tcPr>
+          <w:p>
+            <w:pPr>
+              <w:widowControl w:val="0"/>
+              <w:spacing w:line="240" w:lineRule="auto"/>
+              <w:rPr/>
+            </w:pPr>
+            <w:r>
+              <w:rPr>
+                <w:rtl w:val="0"/>
+              </w:rPr>
+            </w:r>
+          </w:p>
+        </w:tc>
+        <w:tc>
+          <w:tcPr>
+            <w:shd w:fill="auto" w:val="clear"/>
+            <w:tcMar>
+              <w:top w:w="100.0" w:type="dxa"/>
+              <w:left w:w="100.0" w:type="dxa"/>
+              <w:bottom w:w="100.0" w:type="dxa"/>
+              <w:right w:w="100.0" w:type="dxa"/>
+            </w:tcMar>
+            <w:vAlign w:val="top"/>
+          </w:tcPr>
+          <w:p>
+            <w:pPr>
+              <w:widowControl w:val="0"/>
+              <w:spacing w:line="240" w:lineRule="auto"/>
+              <w:rPr/>
+            </w:pPr>
+            <w:r>
+              <w:rPr>
+                <w:rtl w:val="0"/>
+              </w:rPr>
+            </w:r>
+          </w:p>
+        </w:tc>
+        <w:tc>
+          <w:tcPr>
+            <w:shd w:fill="auto" w:val="clear"/>
+            <w:tcMar>
+              <w:top w:w="100.0" w:type="dxa"/>
+              <w:left w:w="100.0" w:type="dxa"/>
+              <w:bottom w:w="100.0" w:type="dxa"/>
+              <w:right w:w="100.0" w:type="dxa"/>
+            </w:tcMar>
+            <w:vAlign w:val="top"/>
+          </w:tcPr>
+          <w:p>
+            <w:pPr>
+              <w:widowControl w:val="0"/>
+              <w:spacing w:line="240" w:lineRule="auto"/>
+              <w:rPr/>
+            </w:pPr>
+            <w:r>
+              <w:rPr>
+                <w:rtl w:val="0"/>
+              </w:rPr>
+            </w:r>
+          </w:p>
+        </w:tc>
+        <w:tc>
+          <w:tcPr>
+            <w:shd w:fill="auto" w:val="clear"/>
+            <w:tcMar>
+              <w:top w:w="100.0" w:type="dxa"/>
+              <w:left w:w="100.0" w:type="dxa"/>
+              <w:bottom w:w="100.0" w:type="dxa"/>
+              <w:right w:w="100.0" w:type="dxa"/>
+            </w:tcMar>
+            <w:vAlign w:val="top"/>
+          </w:tcPr>
+          <w:p>
+            <w:pPr>
+              <w:widowControl w:val="0"/>
+              <w:spacing w:line="240" w:lineRule="auto"/>
+              <w:rPr/>
+            </w:pPr>
+            <w:r>
+              <w:rPr>
+                <w:rtl w:val="0"/>
+              </w:rPr>
+            </w:r>
+          </w:p>
+        </w:tc>
+        <w:tc>
+          <w:tcPr>
+            <w:shd w:fill="auto" w:val="clear"/>
+            <w:tcMar>
+              <w:top w:w="100.0" w:type="dxa"/>
+              <w:left w:w="100.0" w:type="dxa"/>
+              <w:bottom w:w="100.0" w:type="dxa"/>
+              <w:right w:w="100.0" w:type="dxa"/>
+            </w:tcMar>
+            <w:vAlign w:val="top"/>
+          </w:tcPr>
+          <w:p>
+            <w:pPr>
+              <w:widowControl w:val="0"/>
+              <w:spacing w:line="240" w:lineRule="auto"/>
+              <w:rPr/>
+            </w:pPr>
+            <w:r>
+              <w:rPr>
+                <w:rtl w:val="0"/>
+              </w:rPr>
             </w:r>
           </w:p>
         </w:tc>
@@ -3669,6 +4436,27 @@
   </w:style>
   <w:style w:type="paragraph" w:styleId="Normal" w:default="1">
     <w:name w:val="normal"/>
+  </w:style>
+  <w:style w:type="table" w:styleId="TableNormal" w:default="1">
+    <w:name w:val="TableNormal"/>
+    <w:tblPr>
+      <w:tblCellMar>
+        <w:top w:w="100.0" w:type="dxa"/>
+        <w:left w:w="100.0" w:type="dxa"/>
+        <w:bottom w:w="100.0" w:type="dxa"/>
+        <w:right w:w="100.0" w:type="dxa"/>
+      </w:tblCellMar>
+    </w:tblPr>
+  </w:style>
+  <w:style w:type="paragraph" w:styleId="Normal" w:default="1">
+    <w:name w:val="normal"/>
+  </w:style>
+  <w:style w:type="table" w:styleId="Table1">
+    <w:basedOn w:val="TableNormal"/>
+    <w:tblPr>
+      <w:tblStyleRowBandSize w:val="1"/>
+      <w:tblStyleColBandSize w:val="1"/>
+    </w:tblPr>
   </w:style>
   <w:style w:type="table" w:styleId="Table1">
     <w:basedOn w:val="TableNormal"/>
@@ -4028,7 +4816,7 @@
 
 <file path=customXML/item1.xml><?xml version="1.0" encoding="utf-8"?>
 <go:gDocsCustomXmlDataStorage xmlns:go="http://customooxmlschemas.google.com/" xmlns:r="http://schemas.openxmlformats.org/officeDocument/2006/relationships" uri="GoogleDocsCustomDataVersion2">
-  <go:docsCustomData xmlns:go="http://customooxmlschemas.google.com/" roundtripDataSignature="AMtx7mhL81/jPy93RKm8wmMpWDSPZLQeKQ==">CgMxLjA4AHIhMUNtUWpIZlRzb3V3d3Zxakw3WXNjZFQ5aEU3dmRTLXU4</go:docsCustomData>
+  <go:docsCustomData xmlns:go="http://customooxmlschemas.google.com/" roundtripDataSignature="AMtx7mhZ0so/sMLcyWZcIiDICcypSJ07Zw==">CgMxLjA4AHIhMTNQWHZLa0FEYzNoWGNDVzN1Nl9NNndNZnk0N2tYLVZU</go:docsCustomData>
 </go:gDocsCustomXmlDataStorage>
 </file>
 

</xml_diff>